<commit_message>
🎨 Redesign as a black, minimal résumé with a command palette
- Layout based on option D: centred column, photo, icon actions, project cards
- Black by default with an optional light theme, Geist and Geist Mono
- Command palette (Ctrl/Cmd K) to download the CV, switch theme or language and jump to sections
- Profile now leads with technology consulting, LexOS and large-scale implementations
- Drop the Odoo version rail; versions stay as a skill chip
- Regenerate the PDF and DOCX résumés (one page each, 315/346 words)
</commit_message>
<xml_diff>
--- a/public/cv/Naun_Flores_CV_ES.docx
+++ b/public/cv/Naun_Flores_CV_ES.docx
@@ -12,7 +12,7 @@
     </w:p>
     <w:p>
       <w:r>
-        <w:t xml:space="preserve">Developer Senior Odoo y Consultor Funcional. Ingeniero de Sistemas Informáticos.</w:t>
+        <w:t xml:space="preserve">Consultor de tecnología y desarrollador de software. Developer Senior Odoo. Implemento sistemas de gestión e inventario en empresas grandes.</w:t>
       </w:r>
     </w:p>
     <w:p>
@@ -33,7 +33,7 @@
     </w:p>
     <w:p>
       <w:r>
-        <w:t xml:space="preserve">Ingeniero de sistemas que diseña, desarrolla e implementa soluciones ERP con Odoo de principio a fin. Desde 2020 he trabajado con todas las versiones de Odoo, de la 11 a la 19, escribiendo módulos a medida, migrando bases de datos entre versiones e integrando Odoo con sistemas externos con Python y FastAPI. En lo funcional me especializo en contabilidad y nómina, y también configuro flujos de ventas, inventario y compras. Actualmente lidero el equipo de desarrollo e implementación en GRUPO SOLUTECNO, donde convierto requerimientos de negocio en software funcionando y acompaño a los clientes desde el análisis hasta la puesta en marcha.</w:t>
+        <w:t xml:space="preserve">Ingeniero de sistemas y consultor de tecnología que convierte procesos de negocio en software funcionando. Desde 2020 lidero implementaciones de Odoo de principio a fin en GRUPO SOLUTECNO, en todas las versiones de la 11 a la 19: análisis de requerimientos, módulos a medida en Python y OWL, migraciones de datos, integraciones con FastAPI y puesta en marcha. Me especializo en contabilidad y nómina, y he implementado sistemas de gestión e inventario en operaciones grandes. También construyo productos propios, como LexOS, un abogado virtual con toda la jurisprudencia de El Salvador.</w:t>
       </w:r>
     </w:p>
     <w:p>
@@ -61,11 +61,6 @@
       </w:r>
     </w:p>
     <w:p>
-      <w:r>
-        <w:t xml:space="preserve">Desarrollo módulos de Odoo en las versiones 11 a 19 y lidero el equipo que los implementa en empresas cliente, como consultor funcional de contabilidad y nómina.</w:t>
-      </w:r>
-    </w:p>
-    <w:p>
       <w:pPr>
         <w:pStyle w:val="ListParagraph"/>
         <w:numPr>
@@ -154,6 +149,26 @@
         <w:pStyle w:val="Heading1"/>
       </w:pPr>
       <w:r>
+        <w:t xml:space="preserve">Proyectos</w:t>
+      </w:r>
+    </w:p>
+    <w:p>
+      <w:pPr>
+        <w:pStyle w:val="ListParagraph"/>
+        <w:numPr>
+          <w:ilvl w:val="0"/>
+          <w:numId w:val="1"/>
+        </w:numPr>
+      </w:pPr>
+      <w:r>
+        <w:t xml:space="preserve">LexOS: Un abogado virtual con toda la jurisprudencia de El Salvador.</w:t>
+      </w:r>
+    </w:p>
+    <w:p>
+      <w:pPr>
+        <w:pStyle w:val="Heading1"/>
+      </w:pPr>
+      <w:r>
         <w:t xml:space="preserve">Áreas funcionales</w:t>
       </w:r>
     </w:p>
@@ -202,7 +217,7 @@
         </w:numPr>
       </w:pPr>
       <w:r>
-        <w:t xml:space="preserve">Inventario: Control de existencias, valoración de inventario, trazabilidad por lotes y números de serie.</w:t>
+        <w:t xml:space="preserve">Inventario: Control y valoración de existencias, trazabilidad por lotes y números de serie, catálogos grandes.</w:t>
       </w:r>
     </w:p>
     <w:p>
@@ -218,11 +233,6 @@
       </w:r>
     </w:p>
     <w:p>
-      <w:r>
-        <w:t xml:space="preserve">Versiones de Odoo: 11, 12, 13, 14, 15, 16, 17, 18, 19.</w:t>
-      </w:r>
-    </w:p>
-    <w:p>
       <w:pPr>
         <w:pStyle w:val="Heading1"/>
       </w:pPr>
@@ -232,7 +242,7 @@
     </w:p>
     <w:p>
       <w:r>
-        <w:t xml:space="preserve">Python, Odoo ORM, OWL, JavaScript, XML / QWeb, FastAPI, PostgreSQL, Git.</w:t>
+        <w:t xml:space="preserve">Odoo, Python, OWL, FastAPI, JavaScript, PostgreSQL, XML / QWeb, Git.</w:t>
       </w:r>
     </w:p>
     <w:p>
@@ -269,7 +279,7 @@
     </w:p>
     <w:p>
       <w:r>
-        <w:t xml:space="preserve">Español: Nativo</w:t>
+        <w:t xml:space="preserve">Español: Nativo. Inglés: Intermedio</w:t>
       </w:r>
     </w:p>
     <w:sectPr>

</xml_diff>

<commit_message>
📸 Add the profile photo to the PDF and DOCX résumés
The photo sits beside the name; text order, one page and 300+ words are unchanged.
</commit_message>
<xml_diff>
--- a/public/cv/Naun_Flores_CV_ES.docx
+++ b/public/cv/Naun_Flores_CV_ES.docx
@@ -6,6 +6,54 @@
       <w:pPr>
         <w:pStyle w:val="Title"/>
       </w:pPr>
+      <w:r>
+        <w:drawing>
+          <wp:anchor distT="0" distB="0" distL="182880" distR="0" simplePos="0" allowOverlap="1" behindDoc="0" locked="0" layoutInCell="1" relativeHeight="863600">
+            <wp:simplePos x="0" y="0"/>
+            <wp:positionH relativeFrom="margin">
+              <wp:align>right</wp:align>
+            </wp:positionH>
+            <wp:positionV relativeFrom="margin">
+              <wp:align>top</wp:align>
+            </wp:positionV>
+            <wp:extent cx="863600" cy="863600"/>
+            <wp:effectExtent t="0" r="0" b="0" l="0"/>
+            <wp:wrapSquare wrapText="left" distL="182880"/>
+            <wp:docPr id="2" name="Naun Flores" descr="Naun Flores" title="Naun Flores"/>
+            <wp:cNvGraphicFramePr>
+              <a:graphicFrameLocks xmlns:a="http://schemas.openxmlformats.org/drawingml/2006/main" noChangeAspect="1"/>
+            </wp:cNvGraphicFramePr>
+            <a:graphic xmlns:a="http://schemas.openxmlformats.org/drawingml/2006/main">
+              <a:graphicData uri="http://schemas.openxmlformats.org/drawingml/2006/picture">
+                <pic:pic xmlns:pic="http://schemas.openxmlformats.org/drawingml/2006/picture">
+                  <pic:nvPicPr>
+                    <pic:cNvPr id="0" name="" descr=""/>
+                    <pic:cNvPicPr>
+                      <a:picLocks noChangeAspect="1" noChangeArrowheads="1"/>
+                    </pic:cNvPicPr>
+                  </pic:nvPicPr>
+                  <pic:blipFill>
+                    <a:blip r:embed="rId7" cstate="none"/>
+                    <a:srcRect/>
+                    <a:stretch>
+                      <a:fillRect/>
+                    </a:stretch>
+                  </pic:blipFill>
+                  <pic:spPr bwMode="auto">
+                    <a:xfrm>
+                      <a:off x="0" y="0"/>
+                      <a:ext cx="863600" cy="863600"/>
+                    </a:xfrm>
+                    <a:prstGeom prst="rect">
+                      <a:avLst/>
+                    </a:prstGeom>
+                  </pic:spPr>
+                </pic:pic>
+              </a:graphicData>
+            </a:graphic>
+          </wp:anchor>
+        </w:drawing>
+      </w:r>
       <w:r>
         <w:t xml:space="preserve">Naun Flores</w:t>
       </w:r>

</xml_diff>

<commit_message>
🎨 Redesign the PDF and DOCX résumés
Larger header with photo and website, right-aligned dates, bold terms,
skill and language tags, light section rules. Still one page, Arial,
single column, no tables, text boxes, headers or footers. The generator
now fails if the PDF spills onto a second page.
</commit_message>
<xml_diff>
--- a/public/cv/Naun_Flores_CV_ES.docx
+++ b/public/cv/Naun_Flores_CV_ES.docx
@@ -8,7 +8,7 @@
       </w:pPr>
       <w:r>
         <w:drawing>
-          <wp:anchor distT="0" distB="0" distL="182880" distR="0" simplePos="0" allowOverlap="1" behindDoc="0" locked="0" layoutInCell="1" relativeHeight="863600">
+          <wp:anchor distT="0" distB="0" distL="182880" distR="0" simplePos="0" allowOverlap="1" behindDoc="0" locked="0" layoutInCell="1" relativeHeight="965200">
             <wp:simplePos x="0" y="0"/>
             <wp:positionH relativeFrom="margin">
               <wp:align>right</wp:align>
@@ -16,7 +16,7 @@
             <wp:positionV relativeFrom="margin">
               <wp:align>top</wp:align>
             </wp:positionV>
-            <wp:extent cx="863600" cy="863600"/>
+            <wp:extent cx="965200" cy="965200"/>
             <wp:effectExtent t="0" r="0" b="0" l="0"/>
             <wp:wrapSquare wrapText="left" distL="182880"/>
             <wp:docPr id="2" name="Naun Flores" descr="Naun Flores" title="Naun Flores"/>
@@ -42,7 +42,7 @@
                   <pic:spPr bwMode="auto">
                     <a:xfrm>
                       <a:off x="0" y="0"/>
-                      <a:ext cx="863600" cy="863600"/>
+                      <a:ext cx="965200" cy="965200"/>
                     </a:xfrm>
                     <a:prstGeom prst="rect">
                       <a:avLst/>
@@ -59,16 +59,46 @@
       </w:r>
     </w:p>
     <w:p>
-      <w:r>
-        <w:t xml:space="preserve">Consultor de tecnología y desarrollador de software. Developer Senior Odoo. Implemento sistemas de gestión e inventario en empresas grandes.</w:t>
-      </w:r>
-    </w:p>
-    <w:p>
-      <w:r>
-        <w:rPr>
-          <w:color w:val="333333"/>
-        </w:rPr>
-        <w:t xml:space="preserve">El Salvador | linkedin.com/in/naun-flores-485051174 | github.com/naunflores620</w:t>
+      <w:pPr>
+        <w:spacing w:after="20"/>
+      </w:pPr>
+      <w:r>
+        <w:rPr>
+          <w:b/>
+          <w:bCs/>
+          <w:sz w:val="24"/>
+          <w:szCs w:val="24"/>
+        </w:rPr>
+        <w:t xml:space="preserve">Consultor de tecnología y desarrollador de software</w:t>
+      </w:r>
+    </w:p>
+    <w:p>
+      <w:pPr>
+        <w:spacing w:after="100"/>
+      </w:pPr>
+      <w:r>
+        <w:rPr>
+          <w:color w:val="5F6773"/>
+          <w:sz w:val="20"/>
+          <w:szCs w:val="20"/>
+        </w:rPr>
+        <w:t xml:space="preserve">Developer Senior Odoo. Implemento sistemas de gestión e inventario en empresas grandes.</w:t>
+      </w:r>
+    </w:p>
+    <w:p>
+      <w:pPr>
+        <w:pBdr>
+          <w:bottom w:val="single" w:color="111316" w:sz="16" w:space="8"/>
+        </w:pBdr>
+        <w:spacing w:after="160"/>
+      </w:pPr>
+      <w:r>
+        <w:rPr>
+          <w:color w:val="5F6773"/>
+          <w:sz w:val="18"/>
+          <w:szCs w:val="18"/>
+        </w:rPr>
+        <w:t xml:space="preserve">El Salvador | naunflores.com | linkedin.com/in/naun-flores-485051174 | github.com/naunflores620</w:t>
       </w:r>
     </w:p>
     <w:p>
@@ -95,17 +125,32 @@
     <w:p>
       <w:pPr>
         <w:pStyle w:val="Heading2"/>
+        <w:tabs>
+          <w:tab w:val="right" w:pos="9360"/>
+        </w:tabs>
       </w:pPr>
       <w:r>
         <w:t xml:space="preserve">Developer Senior Odoo, Líder de Desarrollo e Implementación</w:t>
       </w:r>
-    </w:p>
-    <w:p>
-      <w:r>
-        <w:rPr>
-          <w:color w:val="333333"/>
-        </w:rPr>
-        <w:t xml:space="preserve">GRUPO SOLUTECNO, S.A. DE C.V. | El Salvador, jornada completa | ene 2020 – Actualidad</w:t>
+      <w:r>
+        <w:rPr>
+          <w:b w:val="false"/>
+          <w:bCs w:val="false"/>
+          <w:color w:val="5F6773"/>
+          <w:sz w:val="18"/>
+          <w:szCs w:val="18"/>
+        </w:rPr>
+        <w:t xml:space="preserve">	ene 2020 – Actualidad</w:t>
+      </w:r>
+    </w:p>
+    <w:p>
+      <w:r>
+        <w:rPr>
+          <w:color w:val="5F6773"/>
+          <w:sz w:val="18"/>
+          <w:szCs w:val="18"/>
+        </w:rPr>
+        <w:t xml:space="preserve">GRUPO SOLUTECNO, S.A. DE C.V., El Salvador, jornada completa</w:t>
       </w:r>
     </w:p>
     <w:p>
@@ -115,6 +160,7 @@
           <w:ilvl w:val="0"/>
           <w:numId w:val="1"/>
         </w:numPr>
+        <w:spacing w:after="30"/>
       </w:pPr>
       <w:r>
         <w:t xml:space="preserve">Lidero el equipo de desarrollo e implementación, planificando el trabajo y cuidando los tiempos de cada proyecto.</w:t>
@@ -127,6 +173,7 @@
           <w:ilvl w:val="0"/>
           <w:numId w:val="1"/>
         </w:numPr>
+        <w:spacing w:after="30"/>
       </w:pPr>
       <w:r>
         <w:t xml:space="preserve">Coordino consultores funcionales y técnicos desde el análisis de requerimientos hasta la puesta en marcha.</w:t>
@@ -139,6 +186,7 @@
           <w:ilvl w:val="0"/>
           <w:numId w:val="1"/>
         </w:numPr>
+        <w:spacing w:after="30"/>
       </w:pPr>
       <w:r>
         <w:t xml:space="preserve">Llevo a Odoo los procesos contables y de nómina de cada cliente como consultor funcional.</w:t>
@@ -151,6 +199,7 @@
           <w:ilvl w:val="0"/>
           <w:numId w:val="1"/>
         </w:numPr>
+        <w:spacing w:after="30"/>
       </w:pPr>
       <w:r>
         <w:t xml:space="preserve">Desarrollo módulos a medida en Python, XML/QWeb y JavaScript (OWL) sobre el ORM de Odoo.</w:t>
@@ -163,6 +212,7 @@
           <w:ilvl w:val="0"/>
           <w:numId w:val="1"/>
         </w:numPr>
+        <w:spacing w:after="30"/>
       </w:pPr>
       <w:r>
         <w:t xml:space="preserve">Migro módulos y bases de datos entre versiones de Odoo conservando la información del negocio.</w:t>
@@ -175,6 +225,7 @@
           <w:ilvl w:val="0"/>
           <w:numId w:val="1"/>
         </w:numPr>
+        <w:spacing w:after="30"/>
       </w:pPr>
       <w:r>
         <w:t xml:space="preserve">Optimizo el rendimiento de vistas, reportes y tareas programadas sobre PostgreSQL.</w:t>
@@ -187,6 +238,7 @@
           <w:ilvl w:val="0"/>
           <w:numId w:val="1"/>
         </w:numPr>
+        <w:spacing w:after="30"/>
       </w:pPr>
       <w:r>
         <w:t xml:space="preserve">Integro Odoo con sistemas externos mediante sus APIs y servicios construidos con FastAPI.</w:t>
@@ -202,14 +254,17 @@
     </w:p>
     <w:p>
       <w:pPr>
-        <w:pStyle w:val="ListParagraph"/>
-        <w:numPr>
-          <w:ilvl w:val="0"/>
-          <w:numId w:val="1"/>
-        </w:numPr>
-      </w:pPr>
-      <w:r>
-        <w:t xml:space="preserve">LexOS: Un abogado virtual con toda la jurisprudencia de El Salvador.</w:t>
+        <w:spacing w:after="40"/>
+      </w:pPr>
+      <w:r>
+        <w:rPr>
+          <w:b/>
+          <w:bCs/>
+        </w:rPr>
+        <w:t xml:space="preserve">LexOS. </w:t>
+      </w:r>
+      <w:r>
+        <w:t xml:space="preserve">Un abogado virtual con toda la jurisprudencia de El Salvador.</w:t>
       </w:r>
     </w:p>
     <w:p>
@@ -222,62 +277,77 @@
     </w:p>
     <w:p>
       <w:pPr>
-        <w:pStyle w:val="ListParagraph"/>
-        <w:numPr>
-          <w:ilvl w:val="0"/>
-          <w:numId w:val="1"/>
-        </w:numPr>
-      </w:pPr>
-      <w:r>
-        <w:t xml:space="preserve">Contabilidad: Plan de cuentas, localización fiscal, conciliación bancaria, estados financieros y reportes.</w:t>
-      </w:r>
-    </w:p>
-    <w:p>
-      <w:pPr>
-        <w:pStyle w:val="ListParagraph"/>
-        <w:numPr>
-          <w:ilvl w:val="0"/>
-          <w:numId w:val="1"/>
-        </w:numPr>
-      </w:pPr>
-      <w:r>
-        <w:t xml:space="preserve">Nómina: Reglas salariales, percepciones y deducciones, prestaciones, seguridad social y recibos de pago.</w:t>
-      </w:r>
-    </w:p>
-    <w:p>
-      <w:pPr>
-        <w:pStyle w:val="ListParagraph"/>
-        <w:numPr>
-          <w:ilvl w:val="0"/>
-          <w:numId w:val="1"/>
-        </w:numPr>
-      </w:pPr>
-      <w:r>
-        <w:t xml:space="preserve">Ventas: Embudo de CRM, cotizaciones, órdenes de venta y facturación electrónica.</w:t>
-      </w:r>
-    </w:p>
-    <w:p>
-      <w:pPr>
-        <w:pStyle w:val="ListParagraph"/>
-        <w:numPr>
-          <w:ilvl w:val="0"/>
-          <w:numId w:val="1"/>
-        </w:numPr>
-      </w:pPr>
-      <w:r>
-        <w:t xml:space="preserve">Inventario: Control y valoración de existencias, trazabilidad por lotes y números de serie, catálogos grandes.</w:t>
-      </w:r>
-    </w:p>
-    <w:p>
-      <w:pPr>
-        <w:pStyle w:val="ListParagraph"/>
-        <w:numPr>
-          <w:ilvl w:val="0"/>
-          <w:numId w:val="1"/>
-        </w:numPr>
-      </w:pPr>
-      <w:r>
-        <w:t xml:space="preserve">Compras: Requisiciones, órdenes de compra y recepciones de mercancía.</w:t>
+        <w:spacing w:after="40"/>
+      </w:pPr>
+      <w:r>
+        <w:rPr>
+          <w:b/>
+          <w:bCs/>
+        </w:rPr>
+        <w:t xml:space="preserve">Contabilidad. </w:t>
+      </w:r>
+      <w:r>
+        <w:t xml:space="preserve">Plan de cuentas, localización fiscal, conciliación bancaria, estados financieros y reportes.</w:t>
+      </w:r>
+    </w:p>
+    <w:p>
+      <w:pPr>
+        <w:spacing w:after="40"/>
+      </w:pPr>
+      <w:r>
+        <w:rPr>
+          <w:b/>
+          <w:bCs/>
+        </w:rPr>
+        <w:t xml:space="preserve">Nómina. </w:t>
+      </w:r>
+      <w:r>
+        <w:t xml:space="preserve">Reglas salariales, percepciones y deducciones, prestaciones, seguridad social y recibos de pago.</w:t>
+      </w:r>
+    </w:p>
+    <w:p>
+      <w:pPr>
+        <w:spacing w:after="40"/>
+      </w:pPr>
+      <w:r>
+        <w:rPr>
+          <w:b/>
+          <w:bCs/>
+        </w:rPr>
+        <w:t xml:space="preserve">Ventas. </w:t>
+      </w:r>
+      <w:r>
+        <w:t xml:space="preserve">Embudo de CRM, cotizaciones, órdenes de venta y facturación electrónica.</w:t>
+      </w:r>
+    </w:p>
+    <w:p>
+      <w:pPr>
+        <w:spacing w:after="40"/>
+      </w:pPr>
+      <w:r>
+        <w:rPr>
+          <w:b/>
+          <w:bCs/>
+        </w:rPr>
+        <w:t xml:space="preserve">Inventario. </w:t>
+      </w:r>
+      <w:r>
+        <w:t xml:space="preserve">Control y valoración de existencias, trazabilidad por lotes y números de serie, catálogos grandes.</w:t>
+      </w:r>
+    </w:p>
+    <w:p>
+      <w:pPr>
+        <w:spacing w:after="40"/>
+      </w:pPr>
+      <w:r>
+        <w:rPr>
+          <w:b/>
+          <w:bCs/>
+        </w:rPr>
+        <w:t xml:space="preserve">Compras. </w:t>
+      </w:r>
+      <w:r>
+        <w:t xml:space="preserve">Requisiciones, órdenes de compra y recepciones de mercancía.</w:t>
       </w:r>
     </w:p>
     <w:p>
@@ -290,7 +360,7 @@
     </w:p>
     <w:p>
       <w:r>
-        <w:t xml:space="preserve">Odoo, Python, OWL, FastAPI, JavaScript, PostgreSQL, XML / QWeb, Git.</w:t>
+        <w:t xml:space="preserve">Odoo  ·  Python  ·  OWL  ·  FastAPI  ·  JavaScript  ·  PostgreSQL  ·  XML / QWeb  ·  Git</w:t>
       </w:r>
     </w:p>
     <w:p>
@@ -304,17 +374,32 @@
     <w:p>
       <w:pPr>
         <w:pStyle w:val="Heading2"/>
+        <w:tabs>
+          <w:tab w:val="right" w:pos="9360"/>
+        </w:tabs>
       </w:pPr>
       <w:r>
         <w:t xml:space="preserve">Ingeniería de Sistemas Informáticos</w:t>
       </w:r>
-    </w:p>
-    <w:p>
-      <w:r>
-        <w:rPr>
-          <w:color w:val="333333"/>
-        </w:rPr>
-        <w:t xml:space="preserve">Universidad de El Salvador | 2016–2021</w:t>
+      <w:r>
+        <w:rPr>
+          <w:b w:val="false"/>
+          <w:bCs w:val="false"/>
+          <w:color w:val="5F6773"/>
+          <w:sz w:val="18"/>
+          <w:szCs w:val="18"/>
+        </w:rPr>
+        <w:t xml:space="preserve">	2016 – 2021</w:t>
+      </w:r>
+    </w:p>
+    <w:p>
+      <w:r>
+        <w:rPr>
+          <w:color w:val="5F6773"/>
+          <w:sz w:val="18"/>
+          <w:szCs w:val="18"/>
+        </w:rPr>
+        <w:t xml:space="preserve">Universidad de El Salvador</w:t>
       </w:r>
     </w:p>
     <w:p>
@@ -327,12 +412,12 @@
     </w:p>
     <w:p>
       <w:r>
-        <w:t xml:space="preserve">Español: Nativo. Inglés: Intermedio</w:t>
+        <w:t xml:space="preserve">Español: Nativo  ·  Inglés: Intermedio</w:t>
       </w:r>
     </w:p>
     <w:sectPr>
       <w:pgSz w:w="11906" w:h="16838" w:orient="portrait"/>
-      <w:pgMar w:top="1080" w:right="1080" w:bottom="1080" w:left="1080" w:header="708" w:footer="708" w:gutter="0"/>
+      <w:pgMar w:top="720" w:right="1008" w:bottom="720" w:left="1008" w:header="708" w:footer="708" w:gutter="0"/>
       <w:pgNumType/>
       <w:docGrid w:linePitch="360"/>
     </w:sectPr>
@@ -515,13 +600,14 @@
     <w:rPrDefault>
       <w:rPr>
         <w:rFonts w:ascii="Arial" w:cs="Arial" w:eastAsia="Arial" w:hAnsi="Arial"/>
-        <w:sz w:val="21"/>
-        <w:szCs w:val="21"/>
+        <w:color w:val="111316"/>
+        <w:sz w:val="19"/>
+        <w:szCs w:val="19"/>
       </w:rPr>
     </w:rPrDefault>
     <w:pPrDefault>
       <w:pPr>
-        <w:spacing w:after="80"/>
+        <w:spacing w:after="60"/>
       </w:pPr>
     </w:pPrDefault>
   </w:docDefaults>
@@ -687,15 +773,15 @@
     <w:name w:val="Title"/>
     <w:basedOn w:val="Normal"/>
     <w:pPr>
-      <w:spacing w:after="80"/>
+      <w:spacing w:after="60"/>
     </w:pPr>
     <w:rPr>
       <w:rFonts w:ascii="Arial" w:cs="Arial" w:eastAsia="Arial" w:hAnsi="Arial"/>
       <w:b/>
       <w:bCs/>
-      <w:color w:val="000000"/>
-      <w:sz w:val="40"/>
-      <w:szCs w:val="40"/>
+      <w:color w:val="111316"/>
+      <w:sz w:val="52"/>
+      <w:szCs w:val="52"/>
     </w:rPr>
   </w:style>
   <w:style w:type="paragraph" w:styleId="Heading1">
@@ -703,15 +789,18 @@
     <w:basedOn w:val="Normal"/>
     <w:next w:val="Normal"/>
     <w:pPr>
-      <w:spacing w:after="80" w:before="280"/>
+      <w:pBdr>
+        <w:bottom w:val="single" w:color="D5DAE1" w:sz="6" w:space="2"/>
+      </w:pBdr>
+      <w:spacing w:after="80" w:before="220"/>
     </w:pPr>
     <w:rPr>
       <w:rFonts w:ascii="Arial" w:cs="Arial" w:eastAsia="Arial" w:hAnsi="Arial"/>
       <w:b/>
       <w:bCs/>
-      <w:color w:val="000000"/>
-      <w:sz w:val="24"/>
-      <w:szCs w:val="24"/>
+      <w:color w:val="111316"/>
+      <w:sz w:val="21"/>
+      <w:szCs w:val="21"/>
     </w:rPr>
   </w:style>
   <w:style w:type="paragraph" w:styleId="Heading2">
@@ -719,15 +808,15 @@
     <w:basedOn w:val="Normal"/>
     <w:next w:val="Normal"/>
     <w:pPr>
-      <w:spacing w:after="0" w:before="160"/>
+      <w:spacing w:after="0" w:before="80"/>
     </w:pPr>
     <w:rPr>
       <w:rFonts w:ascii="Arial" w:cs="Arial" w:eastAsia="Arial" w:hAnsi="Arial"/>
       <w:b/>
       <w:bCs/>
-      <w:color w:val="000000"/>
-      <w:sz w:val="21"/>
-      <w:szCs w:val="21"/>
+      <w:color w:val="111316"/>
+      <w:sz w:val="20"/>
+      <w:szCs w:val="20"/>
     </w:rPr>
   </w:style>
 </w:styles>

</xml_diff>

<commit_message>
✍️ Refocus the CV content on the Odoo specialty
- Title: Senior Odoo Developer · Technical-Functional Consultant (EN/ES)
- Header: location, public email, clickable website, LinkedIn and GitHub links
- Shorter profile without LexOS or technology lists
- Six experience bullets, leading and coordinating merged
- Skills grouped: Odoo development, backend and integrations, frontend, data and tools
- Education shows Graduated; English described as intermediate, self-assessed
- LexOS described without unverifiable coverage claims
- Email button and palette entry on the website
</commit_message>
<xml_diff>
--- a/public/cv/Naun_Flores_CV_ES.docx
+++ b/public/cv/Naun_Flores_CV_ES.docx
@@ -33,7 +33,7 @@
                     </pic:cNvPicPr>
                   </pic:nvPicPr>
                   <pic:blipFill>
-                    <a:blip r:embed="rId7" cstate="none"/>
+                    <a:blip r:embed="rId11" cstate="none"/>
                     <a:srcRect/>
                     <a:stretch>
                       <a:fillRect/>
@@ -60,7 +60,7 @@
     </w:p>
     <w:p>
       <w:pPr>
-        <w:spacing w:after="20"/>
+        <w:spacing w:after="100"/>
       </w:pPr>
       <w:r>
         <w:rPr>
@@ -69,20 +69,7 @@
           <w:sz w:val="24"/>
           <w:szCs w:val="24"/>
         </w:rPr>
-        <w:t xml:space="preserve">Consultor de tecnología y desarrollador de software</w:t>
-      </w:r>
-    </w:p>
-    <w:p>
-      <w:pPr>
-        <w:spacing w:after="100"/>
-      </w:pPr>
-      <w:r>
-        <w:rPr>
-          <w:color w:val="5F6773"/>
-          <w:sz w:val="20"/>
-          <w:szCs w:val="20"/>
-        </w:rPr>
-        <w:t xml:space="preserve">Developer Senior Odoo. Implemento sistemas de gestión e inventario en empresas grandes.</w:t>
+        <w:t xml:space="preserve">Desarrollador sénior Odoo · Consultor técnico-funcional</w:t>
       </w:r>
     </w:p>
     <w:p>
@@ -98,8 +85,80 @@
           <w:sz w:val="18"/>
           <w:szCs w:val="18"/>
         </w:rPr>
-        <w:t xml:space="preserve">El Salvador | naunflores.com | linkedin.com/in/naun-flores-485051174 | github.com/naunflores620</w:t>
-      </w:r>
+        <w:t xml:space="preserve">El Salvador</w:t>
+      </w:r>
+      <w:r>
+        <w:rPr>
+          <w:color w:val="D5DAE1"/>
+          <w:sz w:val="18"/>
+          <w:szCs w:val="18"/>
+        </w:rPr>
+        <w:t xml:space="preserve"> | </w:t>
+      </w:r>
+      <w:hyperlink w:history="1" r:id="rId5d_uvttk1kwx6abtq5rf4">
+        <w:r>
+          <w:rPr>
+            <w:color w:val="111316"/>
+            <w:sz w:val="18"/>
+            <w:szCs w:val="18"/>
+          </w:rPr>
+          <w:t xml:space="preserve">naunflores620@gmail.com</w:t>
+        </w:r>
+      </w:hyperlink>
+      <w:r>
+        <w:rPr>
+          <w:color w:val="D5DAE1"/>
+          <w:sz w:val="18"/>
+          <w:szCs w:val="18"/>
+        </w:rPr>
+        <w:t xml:space="preserve"> | </w:t>
+      </w:r>
+      <w:hyperlink w:history="1" r:id="rIdoatk1sb9ofb4l6jprhhab">
+        <w:r>
+          <w:rPr>
+            <w:color w:val="111316"/>
+            <w:sz w:val="18"/>
+            <w:szCs w:val="18"/>
+          </w:rPr>
+          <w:t xml:space="preserve">naunflores.com</w:t>
+        </w:r>
+      </w:hyperlink>
+      <w:r>
+        <w:rPr>
+          <w:color w:val="D5DAE1"/>
+          <w:sz w:val="18"/>
+          <w:szCs w:val="18"/>
+        </w:rPr>
+        <w:t xml:space="preserve"> | </w:t>
+      </w:r>
+      <w:hyperlink w:history="1" r:id="rIdhbb9djkylqjduivtwn9tk">
+        <w:r>
+          <w:rPr>
+            <w:color w:val="111316"/>
+            <w:sz w:val="18"/>
+            <w:szCs w:val="18"/>
+          </w:rPr>
+          <w:t xml:space="preserve">LinkedIn</w:t>
+        </w:r>
+      </w:hyperlink>
+      <w:r>
+        <w:rPr>
+          <w:color w:val="D5DAE1"/>
+          <w:sz w:val="18"/>
+          <w:szCs w:val="18"/>
+        </w:rPr>
+        <w:t xml:space="preserve"> | </w:t>
+      </w:r>
+      <w:hyperlink w:history="1" r:id="rIdpawaoikpqpt0mrr12ppj2">
+        <w:r>
+          <w:rPr>
+            <w:color w:val="111316"/>
+            <w:sz w:val="18"/>
+            <w:szCs w:val="18"/>
+          </w:rPr>
+          <w:t xml:space="preserve">GitHub</w:t>
+        </w:r>
+      </w:hyperlink>
     </w:p>
     <w:p>
       <w:pPr>
@@ -111,7 +170,7 @@
     </w:p>
     <w:p>
       <w:r>
-        <w:t xml:space="preserve">Ingeniero de sistemas y consultor de tecnología que convierte procesos de negocio en software funcionando. Desde 2020 lidero implementaciones de Odoo de principio a fin en GRUPO SOLUTECNO, en todas las versiones de la 11 a la 19: análisis de requerimientos, módulos a medida en Python y OWL, migraciones de datos, integraciones con FastAPI y puesta en marcha. Me especializo en contabilidad y nómina, y he implementado sistemas de gestión e inventario en operaciones grandes. También construyo productos propios, como LexOS, un abogado virtual con toda la jurisprudencia de El Salvador.</w:t>
+        <w:t xml:space="preserve">Desarrollador sénior Odoo y consultor técnico-funcional, trabajando con Odoo desde 2020. Acompaño a las empresas desde el análisis de procesos hasta la puesta en marcha: requerimientos, desarrollo a medida, integraciones y migración de datos. Mi diferencial es combinar el desarrollo con conocimiento funcional de contabilidad y nómina, para que lo que construyo encaje con la operación real del negocio, incluidos procesos de gestión e inventario en operaciones grandes.</w:t>
       </w:r>
     </w:p>
     <w:p>
@@ -130,7 +189,7 @@
         </w:tabs>
       </w:pPr>
       <w:r>
-        <w:t xml:space="preserve">Developer Senior Odoo, Líder de Desarrollo e Implementación</w:t>
+        <w:t xml:space="preserve">Desarrollador sénior Odoo, Líder de Desarrollo e Implementación</w:t>
       </w:r>
       <w:r>
         <w:rPr>
@@ -163,7 +222,7 @@
         <w:spacing w:after="30"/>
       </w:pPr>
       <w:r>
-        <w:t xml:space="preserve">Lidero el equipo de desarrollo e implementación, planificando el trabajo y cuidando los tiempos de cada proyecto.</w:t>
+        <w:t xml:space="preserve">Lidero el equipo de desarrollo e implementación y coordino a consultores funcionales y técnicos desde el análisis de requerimientos hasta la puesta en marcha.</w:t>
       </w:r>
     </w:p>
     <w:p>
@@ -176,7 +235,7 @@
         <w:spacing w:after="30"/>
       </w:pPr>
       <w:r>
-        <w:t xml:space="preserve">Coordino consultores funcionales y técnicos desde el análisis de requerimientos hasta la puesta en marcha.</w:t>
+        <w:t xml:space="preserve">Traduzco los procesos contables y de nómina de cada cliente a configuración y funcionalidad a medida en Odoo como consultor técnico-funcional.</w:t>
       </w:r>
     </w:p>
     <w:p>
@@ -189,7 +248,7 @@
         <w:spacing w:after="30"/>
       </w:pPr>
       <w:r>
-        <w:t xml:space="preserve">Llevo a Odoo los procesos contables y de nómina de cada cliente como consultor funcional.</w:t>
+        <w:t xml:space="preserve">Implemento procesos de gestión e inventario en empresas con operaciones grandes.</w:t>
       </w:r>
     </w:p>
     <w:p>
@@ -202,7 +261,7 @@
         <w:spacing w:after="30"/>
       </w:pPr>
       <w:r>
-        <w:t xml:space="preserve">Desarrollo módulos a medida en Python, XML/QWeb y JavaScript (OWL) sobre el ORM de Odoo.</w:t>
+        <w:t xml:space="preserve">Desarrollo módulos a medida con el ORM de Odoo, Python, XML/QWeb y OWL, y optimizo vistas, reportes y tareas programadas lentas sobre PostgreSQL.</w:t>
       </w:r>
     </w:p>
     <w:p>
@@ -215,7 +274,7 @@
         <w:spacing w:after="30"/>
       </w:pPr>
       <w:r>
-        <w:t xml:space="preserve">Migro módulos y bases de datos entre versiones de Odoo conservando la información del negocio.</w:t>
+        <w:t xml:space="preserve">Migro módulos y bases de datos entre versiones de Odoo, de la 11 a la 19, conservando la información del negocio.</w:t>
       </w:r>
     </w:p>
     <w:p>
@@ -228,19 +287,6 @@
         <w:spacing w:after="30"/>
       </w:pPr>
       <w:r>
-        <w:t xml:space="preserve">Optimizo el rendimiento de vistas, reportes y tareas programadas sobre PostgreSQL.</w:t>
-      </w:r>
-    </w:p>
-    <w:p>
-      <w:pPr>
-        <w:pStyle w:val="ListParagraph"/>
-        <w:numPr>
-          <w:ilvl w:val="0"/>
-          <w:numId w:val="1"/>
-        </w:numPr>
-        <w:spacing w:after="30"/>
-      </w:pPr>
-      <w:r>
         <w:t xml:space="preserve">Integro Odoo con sistemas externos mediante sus APIs y servicios construidos con FastAPI.</w:t>
       </w:r>
     </w:p>
@@ -264,7 +310,7 @@
         <w:t xml:space="preserve">LexOS. </w:t>
       </w:r>
       <w:r>
-        <w:t xml:space="preserve">Un abogado virtual con toda la jurisprudencia de El Salvador.</w:t>
+        <w:t xml:space="preserve">Producto propio: un asistente legal virtual construido sobre jurisprudencia de El Salvador.</w:t>
       </w:r>
     </w:p>
     <w:p>
@@ -272,7 +318,7 @@
         <w:pStyle w:val="Heading1"/>
       </w:pPr>
       <w:r>
-        <w:t xml:space="preserve">Áreas funcionales</w:t>
+        <w:t xml:space="preserve">Habilidades técnicas</w:t>
       </w:r>
     </w:p>
     <w:p>
@@ -284,10 +330,10 @@
           <w:b/>
           <w:bCs/>
         </w:rPr>
-        <w:t xml:space="preserve">Contabilidad. </w:t>
-      </w:r>
-      <w:r>
-        <w:t xml:space="preserve">Plan de cuentas, localización fiscal, conciliación bancaria, estados financieros y reportes.</w:t>
+        <w:t xml:space="preserve">Desarrollo Odoo. </w:t>
+      </w:r>
+      <w:r>
+        <w:t xml:space="preserve">Odoo ORM, Módulos a medida, XML / QWeb, OWL.</w:t>
       </w:r>
     </w:p>
     <w:p>
@@ -299,10 +345,10 @@
           <w:b/>
           <w:bCs/>
         </w:rPr>
-        <w:t xml:space="preserve">Nómina. </w:t>
-      </w:r>
-      <w:r>
-        <w:t xml:space="preserve">Reglas salariales, percepciones y deducciones, prestaciones, seguridad social y recibos de pago.</w:t>
+        <w:t xml:space="preserve">Backend e integraciones. </w:t>
+      </w:r>
+      <w:r>
+        <w:t xml:space="preserve">Python, FastAPI, APIs.</w:t>
       </w:r>
     </w:p>
     <w:p>
@@ -314,10 +360,10 @@
           <w:b/>
           <w:bCs/>
         </w:rPr>
-        <w:t xml:space="preserve">Ventas. </w:t>
-      </w:r>
-      <w:r>
-        <w:t xml:space="preserve">Embudo de CRM, cotizaciones, órdenes de venta y facturación electrónica.</w:t>
+        <w:t xml:space="preserve">Frontend. </w:t>
+      </w:r>
+      <w:r>
+        <w:t xml:space="preserve">JavaScript, OWL.</w:t>
       </w:r>
     </w:p>
     <w:p>
@@ -329,10 +375,18 @@
           <w:b/>
           <w:bCs/>
         </w:rPr>
-        <w:t xml:space="preserve">Inventario. </w:t>
-      </w:r>
-      <w:r>
-        <w:t xml:space="preserve">Control y valoración de existencias, trazabilidad por lotes y números de serie, catálogos grandes.</w:t>
+        <w:t xml:space="preserve">Datos y herramientas. </w:t>
+      </w:r>
+      <w:r>
+        <w:t xml:space="preserve">PostgreSQL, Git.</w:t>
+      </w:r>
+    </w:p>
+    <w:p>
+      <w:pPr>
+        <w:pStyle w:val="Heading1"/>
+      </w:pPr>
+      <w:r>
+        <w:t xml:space="preserve">Áreas funcionales</w:t>
       </w:r>
     </w:p>
     <w:p>
@@ -344,23 +398,70 @@
           <w:b/>
           <w:bCs/>
         </w:rPr>
+        <w:t xml:space="preserve">Contabilidad. </w:t>
+      </w:r>
+      <w:r>
+        <w:t xml:space="preserve">Plan de cuentas, diarios, conciliación bancaria, estados financieros y reportes contables.</w:t>
+      </w:r>
+    </w:p>
+    <w:p>
+      <w:pPr>
+        <w:spacing w:after="40"/>
+      </w:pPr>
+      <w:r>
+        <w:rPr>
+          <w:b/>
+          <w:bCs/>
+        </w:rPr>
+        <w:t xml:space="preserve">Nómina. </w:t>
+      </w:r>
+      <w:r>
+        <w:t xml:space="preserve">Reglas salariales, percepciones y deducciones, prestaciones, seguridad social y recibos de pago.</w:t>
+      </w:r>
+    </w:p>
+    <w:p>
+      <w:pPr>
+        <w:spacing w:after="40"/>
+      </w:pPr>
+      <w:r>
+        <w:rPr>
+          <w:b/>
+          <w:bCs/>
+        </w:rPr>
+        <w:t xml:space="preserve">Inventario. </w:t>
+      </w:r>
+      <w:r>
+        <w:t xml:space="preserve">Control y valoración de existencias, trazabilidad por lote y número de serie, catálogos grandes.</w:t>
+      </w:r>
+    </w:p>
+    <w:p>
+      <w:pPr>
+        <w:spacing w:after="40"/>
+      </w:pPr>
+      <w:r>
+        <w:rPr>
+          <w:b/>
+          <w:bCs/>
+        </w:rPr>
+        <w:t xml:space="preserve">Ventas. </w:t>
+      </w:r>
+      <w:r>
+        <w:t xml:space="preserve">Embudo de CRM, cotizaciones, órdenes de venta y facturación electrónica.</w:t>
+      </w:r>
+    </w:p>
+    <w:p>
+      <w:pPr>
+        <w:spacing w:after="40"/>
+      </w:pPr>
+      <w:r>
+        <w:rPr>
+          <w:b/>
+          <w:bCs/>
+        </w:rPr>
         <w:t xml:space="preserve">Compras. </w:t>
       </w:r>
       <w:r>
-        <w:t xml:space="preserve">Requisiciones, órdenes de compra y recepciones de mercancía.</w:t>
-      </w:r>
-    </w:p>
-    <w:p>
-      <w:pPr>
-        <w:pStyle w:val="Heading1"/>
-      </w:pPr>
-      <w:r>
-        <w:t xml:space="preserve">Habilidades técnicas</w:t>
-      </w:r>
-    </w:p>
-    <w:p>
-      <w:r>
-        <w:t xml:space="preserve">Odoo  ·  Python  ·  OWL  ·  FastAPI  ·  JavaScript  ·  PostgreSQL  ·  XML / QWeb  ·  Git</w:t>
+        <w:t xml:space="preserve">Requisiciones, órdenes de compra y recepción de mercancía.</w:t>
       </w:r>
     </w:p>
     <w:p>
@@ -399,7 +500,7 @@
           <w:sz w:val="18"/>
           <w:szCs w:val="18"/>
         </w:rPr>
-        <w:t xml:space="preserve">Universidad de El Salvador</w:t>
+        <w:t xml:space="preserve">Universidad de El Salvador, Graduado</w:t>
       </w:r>
     </w:p>
     <w:p>
@@ -411,8 +512,33 @@
       </w:r>
     </w:p>
     <w:p>
-      <w:r>
-        <w:t xml:space="preserve">Español: Nativo  ·  Inglés: Intermedio</w:t>
+      <w:pPr>
+        <w:spacing w:after="40"/>
+      </w:pPr>
+      <w:r>
+        <w:rPr>
+          <w:b/>
+          <w:bCs/>
+        </w:rPr>
+        <w:t xml:space="preserve">Español. </w:t>
+      </w:r>
+      <w:r>
+        <w:t xml:space="preserve">Nativo.</w:t>
+      </w:r>
+    </w:p>
+    <w:p>
+      <w:pPr>
+        <w:spacing w:after="40"/>
+      </w:pPr>
+      <w:r>
+        <w:rPr>
+          <w:b/>
+          <w:bCs/>
+        </w:rPr>
+        <w:t xml:space="preserve">Inglés. </w:t>
+      </w:r>
+      <w:r>
+        <w:t xml:space="preserve">Intermedio, autoevaluado: documentación técnica y comunicación escrita.</w:t>
       </w:r>
     </w:p>
     <w:sectPr>

</xml_diff>

<commit_message>
👥 Add team size, sectors and full-ERP scope to the CV
Leads 3 developers and 2 IT support specialists; end-to-end ERP
implementations integrating every business area for companies in
manufacturing, import and distribution, restaurants and seafood import.
</commit_message>
<xml_diff>
--- a/public/cv/Naun_Flores_CV_ES.docx
+++ b/public/cv/Naun_Flores_CV_ES.docx
@@ -95,7 +95,7 @@
         </w:rPr>
         <w:t xml:space="preserve"> | </w:t>
       </w:r>
-      <w:hyperlink w:history="1" r:id="rId5d_uvttk1kwx6abtq5rf4">
+      <w:hyperlink w:history="1" r:id="rIdqhf6keilfvl5tu_nquj8o">
         <w:r>
           <w:rPr>
             <w:color w:val="111316"/>
@@ -113,7 +113,7 @@
         </w:rPr>
         <w:t xml:space="preserve"> | </w:t>
       </w:r>
-      <w:hyperlink w:history="1" r:id="rIdoatk1sb9ofb4l6jprhhab">
+      <w:hyperlink w:history="1" r:id="rIdogklesjrtka2jpfbzufyw">
         <w:r>
           <w:rPr>
             <w:color w:val="111316"/>
@@ -131,7 +131,7 @@
         </w:rPr>
         <w:t xml:space="preserve"> | </w:t>
       </w:r>
-      <w:hyperlink w:history="1" r:id="rIdhbb9djkylqjduivtwn9tk">
+      <w:hyperlink w:history="1" r:id="rIdbv9-bar-k8m2pe7rj2kku">
         <w:r>
           <w:rPr>
             <w:color w:val="111316"/>
@@ -149,7 +149,7 @@
         </w:rPr>
         <w:t xml:space="preserve"> | </w:t>
       </w:r>
-      <w:hyperlink w:history="1" r:id="rIdpawaoikpqpt0mrr12ppj2">
+      <w:hyperlink w:history="1" r:id="rIdshgdexqjpxdxmknr5rs5b">
         <w:r>
           <w:rPr>
             <w:color w:val="111316"/>
@@ -170,7 +170,7 @@
     </w:p>
     <w:p>
       <w:r>
-        <w:t xml:space="preserve">Desarrollador sénior Odoo y consultor técnico-funcional, trabajando con Odoo desde 2020. Acompaño a las empresas desde el análisis de procesos hasta la puesta en marcha: requerimientos, desarrollo a medida, integraciones y migración de datos. Mi diferencial es combinar el desarrollo con conocimiento funcional de contabilidad y nómina, para que lo que construyo encaje con la operación real del negocio, incluidos procesos de gestión e inventario en operaciones grandes.</w:t>
+        <w:t xml:space="preserve">Desarrollador sénior Odoo y consultor técnico-funcional, trabajando con Odoo desde 2020. Lidero implementaciones de ERP de principio a fin que integran todas las áreas de la empresa, desde contabilidad, nómina e inventario hasta ventas, compras y producción, para empresas de El Salvador en fabricación, importación y venta, restaurantes e importación de mariscos. Mi diferencial es combinar el desarrollo con conocimiento funcional de cómo operan realmente esos negocios.</w:t>
       </w:r>
     </w:p>
     <w:p>
@@ -222,7 +222,7 @@
         <w:spacing w:after="30"/>
       </w:pPr>
       <w:r>
-        <w:t xml:space="preserve">Lidero el equipo de desarrollo e implementación y coordino a consultores funcionales y técnicos desde el análisis de requerimientos hasta la puesta en marcha.</w:t>
+        <w:t xml:space="preserve">Dirijo un equipo de 3 desarrolladores y 2 especialistas de soporte TI, coordinando desarrollo, implementación y soporte desde el análisis de requerimientos hasta la puesta en marcha.</w:t>
       </w:r>
     </w:p>
     <w:p>
@@ -235,7 +235,7 @@
         <w:spacing w:after="30"/>
       </w:pPr>
       <w:r>
-        <w:t xml:space="preserve">Traduzco los procesos contables y de nómina de cada cliente a configuración y funcionalidad a medida en Odoo como consultor técnico-funcional.</w:t>
+        <w:t xml:space="preserve">Implemento ERP de principio a fin que integran todas las áreas del negocio, en empresas de fabricación, importación y venta, restaurantes e importación de mariscos.</w:t>
       </w:r>
     </w:p>
     <w:p>
@@ -248,7 +248,7 @@
         <w:spacing w:after="30"/>
       </w:pPr>
       <w:r>
-        <w:t xml:space="preserve">Implemento procesos de gestión e inventario en empresas con operaciones grandes.</w:t>
+        <w:t xml:space="preserve">Traduzco los procesos de cada cliente, de contabilidad y nómina a inventario y ventas, a configuración y funcionalidad a medida en Odoo como consultor técnico-funcional.</w:t>
       </w:r>
     </w:p>
     <w:p>
@@ -390,6 +390,11 @@
       </w:r>
     </w:p>
     <w:p>
+      <w:r>
+        <w:t xml:space="preserve">Integración completa de todas las áreas de la empresa en un solo ERP, para empresas de El Salvador.</w:t>
+      </w:r>
+    </w:p>
+    <w:p>
       <w:pPr>
         <w:spacing w:after="40"/>
       </w:pPr>
@@ -398,10 +403,10 @@
           <w:b/>
           <w:bCs/>
         </w:rPr>
-        <w:t xml:space="preserve">Contabilidad. </w:t>
-      </w:r>
-      <w:r>
-        <w:t xml:space="preserve">Plan de cuentas, diarios, conciliación bancaria, estados financieros y reportes contables.</w:t>
+        <w:t xml:space="preserve">Áreas. </w:t>
+      </w:r>
+      <w:r>
+        <w:t xml:space="preserve">Contabilidad, Nómina, Inventario, Fabricación, Ventas, Compras.</w:t>
       </w:r>
     </w:p>
     <w:p>
@@ -413,55 +418,10 @@
           <w:b/>
           <w:bCs/>
         </w:rPr>
-        <w:t xml:space="preserve">Nómina. </w:t>
-      </w:r>
-      <w:r>
-        <w:t xml:space="preserve">Reglas salariales, percepciones y deducciones, prestaciones, seguridad social y recibos de pago.</w:t>
-      </w:r>
-    </w:p>
-    <w:p>
-      <w:pPr>
-        <w:spacing w:after="40"/>
-      </w:pPr>
-      <w:r>
-        <w:rPr>
-          <w:b/>
-          <w:bCs/>
-        </w:rPr>
-        <w:t xml:space="preserve">Inventario. </w:t>
-      </w:r>
-      <w:r>
-        <w:t xml:space="preserve">Control y valoración de existencias, trazabilidad por lote y número de serie, catálogos grandes.</w:t>
-      </w:r>
-    </w:p>
-    <w:p>
-      <w:pPr>
-        <w:spacing w:after="40"/>
-      </w:pPr>
-      <w:r>
-        <w:rPr>
-          <w:b/>
-          <w:bCs/>
-        </w:rPr>
-        <w:t xml:space="preserve">Ventas. </w:t>
-      </w:r>
-      <w:r>
-        <w:t xml:space="preserve">Embudo de CRM, cotizaciones, órdenes de venta y facturación electrónica.</w:t>
-      </w:r>
-    </w:p>
-    <w:p>
-      <w:pPr>
-        <w:spacing w:after="40"/>
-      </w:pPr>
-      <w:r>
-        <w:rPr>
-          <w:b/>
-          <w:bCs/>
-        </w:rPr>
-        <w:t xml:space="preserve">Compras. </w:t>
-      </w:r>
-      <w:r>
-        <w:t xml:space="preserve">Requisiciones, órdenes de compra y recepción de mercancía.</w:t>
+        <w:t xml:space="preserve">Sectores. </w:t>
+      </w:r>
+      <w:r>
+        <w:t xml:space="preserve">Fabricación, Importación y venta, Restaurantes, Importación de mariscos.</w:t>
       </w:r>
     </w:p>
     <w:p>

</xml_diff>